<commit_message>
Add ACS numbered citations and superscript rendering: manuscript/manuscript_biorxiv.docx
</commit_message>
<xml_diff>
--- a/manuscript/manuscript_biorxiv.docx
+++ b/manuscript/manuscript_biorxiv.docx
@@ -71,7 +71,22 @@
     </w:p>
     <w:p>
       <w:r>
-        <w:t>Periplasmic binding protein (PBP) biosensors are useful because they turn small-molecule binding into a fluorescent readout. A PBP closes around a ligand, and a circularly permuted fluorescent protein (cpGFP) inserted into the scaffold converts that motion into a change in fluorescence (Figure 1A,B). The result is a genetically encoded sensor that can be purified for analytical assays, immobilized in a device, or expressed inside cells (Bera et al., 2019; Unger et al., 2020; Nichols et al., 2022).</w:t>
+        <w:t>Periplasmic binding protein (PBP) biosensors are useful because they turn small-molecule binding into a fluorescent readout. A PBP closes around a ligand, and a circularly permuted fluorescent protein (cpGFP) inserted into the scaffold converts that motion into a change in fluorescence (Figure 1A,B).</w:t>
+      </w:r>
+      <w:r>
+        <w:rPr>
+          <w:vertAlign w:val="superscript"/>
+        </w:rPr>
+        <w:t>1</w:t>
+      </w:r>
+      <w:r>
+        <w:t xml:space="preserve"> The result is a genetically encoded sensor that can be purified for analytical assays, immobilized in a device, or expressed inside cells.</w:t>
+      </w:r>
+      <w:r>
+        <w:rPr>
+          <w:vertAlign w:val="superscript"/>
+        </w:rPr>
+        <w:t>2-4</w:t>
       </w:r>
     </w:p>
     <w:p>
@@ -81,12 +96,39 @@
     </w:p>
     <w:p>
       <w:r>
-        <w:t>Protein design and structure prediction are improving quickly, but allosteric biosensors remain a difficult class. They need ligand binding, conformational switching, fluorescence coupling, and expression behavior to work together. For this reason, an experimentally detected weak hit can be valuable. A ΔF/F0 response around 0.3 is already a foothold: the scaffold binds something in a geometry that can move the reporter, even if affinity, dynamic range, and selectivity still need tuning.</w:t>
+        <w:t>Protein design and structure prediction are improving quickly,</w:t>
+      </w:r>
+      <w:r>
+        <w:rPr>
+          <w:vertAlign w:val="superscript"/>
+        </w:rPr>
+        <w:t>5,6</w:t>
+      </w:r>
+      <w:r>
+        <w:t xml:space="preserve"> but allosteric biosensors remain a difficult class. They need ligand binding, conformational switching, fluorescence coupling, and expression behavior to work together. For this reason, an experimentally detected weak hit can be valuable. A ΔF/F0 response around 0.3 is already a foothold: the scaffold binds something in a geometry that can move the reporter, even if affinity, dynamic range, and selectivity still need tuning.</w:t>
       </w:r>
     </w:p>
     <w:p>
       <w:r>
-        <w:t>We tested whether such footholds already exist inside an evolved OpuBC/cpGFP biosensor family. OpuBC is a choline-binding PBP that has been repurposed into sensors for nicotine, nicotinic agonists, SSRIs, opioids, and related drug-like ligands (Shivange et al., 2019; Nichols et al., 2022; Muthusamy et al., 2022; Haloi et al., 2024). Many constructs in this family are intermediates rather than final published sensors, which makes them useful for asking a broader question: how much chemical recognition was created, retained, or exposed during those engineering paths?</w:t>
+        <w:t>We tested whether such footholds already exist inside an evolved OpuBC/cpGFP biosensor family. OpuBC is a choline-binding PBP</w:t>
+      </w:r>
+      <w:r>
+        <w:rPr>
+          <w:vertAlign w:val="superscript"/>
+        </w:rPr>
+        <w:t>7</w:t>
+      </w:r>
+      <w:r>
+        <w:t xml:space="preserve"> that has been repurposed into sensors for nicotine, nicotinic agonists, SSRIs, opioids, and related drug-like ligands.</w:t>
+      </w:r>
+      <w:r>
+        <w:rPr>
+          <w:vertAlign w:val="superscript"/>
+        </w:rPr>
+        <w:t>4,8-10</w:t>
+      </w:r>
+      <w:r>
+        <w:t xml:space="preserve"> Many constructs in this family are intermediates rather than final published sensors, which makes them useful for asking a broader question: how much chemical recognition was created, retained, or exposed during those engineering paths?</w:t>
       </w:r>
     </w:p>
     <w:p>
@@ -175,7 +217,46 @@
         <w:rPr>
           <w:sz w:val="19"/>
         </w:rPr>
-        <w:t xml:space="preserve"> (A) Crystal structure of iNicSnFR3a (cc93; PDB 7S7U) colored by module: the periplasmic binding protein (PBP) recognition domain (magenta), the circularly permuted GFP reporter (cpGFP, green), and the connecting linkers (cyan). Orange spheres mark the 31 positions that vary across the 17-member scaffold family (Cα shown); the four aromatic-cage residues Y65, Y357, F391, and W436 are drawn as yellow sticks and the GFP chromophore is shown in limon. (B) Sensing mechanism: ligand binding closes the PBP, and this motion is transmitted through the linkers to switch cpGFP from a dim to a bright state. (C) Close-up of the binding pocket with ciprofloxacin (yellow sticks) placed by blind diffusion docking (DiffDock-L). Aromatic-cage and pocket residues are shown as marine sticks (Y65, Y357, F391, W436, Y460, T360). The pose is illustrative of a plausible binding geometry in the cage; the 7S7U structure has no ligand resolved in the pocket, and the geometry has not been experimentally determined. Residue 457 is phenylalanine (F457) in this family. (D) Full-length structure prediction (ESMFold; mean pLDDT ≈ 70) superposed on the 7S7U crystal (grey) over the PBP domain. The predicted PBP lobes (blue) overlay the crystal closely (Cα RMSD 1.3 Å across the folded core), whereas the predicted linker and cpGFP module (orange) are displaced by ≈ 21 Å in the same frame. Current end-to-end predictors reproduce the PBP fold but not the placement of the inserted reporter, so structure-guided design in this family is presently anchored on the experimental PBP scaffold.</w:t>
+        <w:t xml:space="preserve"> (A) Crystal structure of iNicSnFR3a (cc93; PDB 7S7U</w:t>
+      </w:r>
+      <w:r>
+        <w:rPr>
+          <w:sz w:val="19"/>
+          <w:vertAlign w:val="superscript"/>
+        </w:rPr>
+        <w:t>4</w:t>
+      </w:r>
+      <w:r>
+        <w:rPr>
+          <w:sz w:val="19"/>
+        </w:rPr>
+        <w:t>) colored by module: the periplasmic binding protein (PBP) recognition domain (magenta), the circularly permuted GFP reporter (cpGFP, green), and the connecting linkers (cyan). Orange spheres mark the 31 positions that vary across the 17-member scaffold family (Cα shown); the four aromatic-cage residues Y65, Y357, F391, and W436 are drawn as yellow sticks and the GFP chromophore is shown in limon. (B) Sensing mechanism: ligand binding closes the PBP, and this motion is transmitted through the linkers to switch cpGFP from a dim to a bright state. (C) Close-up of the binding pocket with ciprofloxacin (yellow sticks) placed by blind diffusion docking (DiffDock-L).</w:t>
+      </w:r>
+      <w:r>
+        <w:rPr>
+          <w:sz w:val="19"/>
+          <w:vertAlign w:val="superscript"/>
+        </w:rPr>
+        <w:t>11</w:t>
+      </w:r>
+      <w:r>
+        <w:rPr>
+          <w:sz w:val="19"/>
+        </w:rPr>
+        <w:t xml:space="preserve"> Aromatic-cage and pocket residues are shown as marine sticks (Y65, Y357, F391, W436, Y460, T360). The pose is illustrative of a plausible binding geometry in the cage; the 7S7U structure has no ligand resolved in the pocket, and the geometry has not been experimentally determined. Residue 457 is phenylalanine (F457) in this family. (D) Full-length structure prediction (ESMFold</w:t>
+      </w:r>
+      <w:r>
+        <w:rPr>
+          <w:sz w:val="19"/>
+          <w:vertAlign w:val="superscript"/>
+        </w:rPr>
+        <w:t>6</w:t>
+      </w:r>
+      <w:r>
+        <w:rPr>
+          <w:sz w:val="19"/>
+        </w:rPr>
+        <w:t>; mean pLDDT ≈ 70) superposed on the 7S7U crystal (grey) over the PBP domain. The predicted PBP lobes (blue) overlay the crystal closely (Cα RMSD 1.3 Å across the folded core), whereas the predicted linker and cpGFP module (orange) are displaced by ≈ 21 Å in the same frame. Current end-to-end predictors reproduce the PBP fold but not the placement of the inserted reporter, so structure-guided design in this family is presently anchored on the experimental PBP scaffold.</w:t>
       </w:r>
     </w:p>
     <w:p>
@@ -201,7 +282,16 @@
     </w:p>
     <w:p>
       <w:r>
-        <w:t>This family is useful because the sensors are close in sequence but far enough apart functionally to probe latent scope. Across the 17 scaffold sensors, pairwise identity ranges from 95.0 to 99.8%. Only 31 of 521 aligned positions vary, and several changes fall near residues already implicated in selectivity, including Y357 and W436. W436 sits in the aromatic cage that helps recognize cationic ligands in this family, so mutations at this position are plausible switches for substrate scope (Figure 1C,D).</w:t>
+        <w:t>This family is useful because the sensors are close in sequence but far enough apart functionally to probe latent scope. Across the 17 scaffold sensors, pairwise identity ranges from 95.0 to 99.8%. Only 31 of 521 aligned positions vary, and several changes fall near residues already implicated in selectivity, including Y357 and W436. W436 sits in the aromatic cage that helps recognize cationic ligands in this family,</w:t>
+      </w:r>
+      <w:r>
+        <w:rPr>
+          <w:vertAlign w:val="superscript"/>
+        </w:rPr>
+        <w:t>12</w:t>
+      </w:r>
+      <w:r>
+        <w:t xml:space="preserve"> so mutations at this position are plausible switches for substrate scope (Figure 1C,D).</w:t>
       </w:r>
     </w:p>
     <w:p>
@@ -376,7 +466,16 @@
     </w:p>
     <w:p>
       <w:r>
-        <w:t>Those fitted EC50 values sit above standard plasma exposure, but the curves still produce measurable fluorescence changes in the clinically relevant range. The ciprofloxacin prescribing label reports a steady-state Cmax of 2.97 µg/mL for 500 mg oral ciprofloxacin every 12 hours, which is about 9 µM given a molecular weight of 331.4 g/mol (DailyMed, 2025). At 6.3 to 20 µM ciprofloxacin, the 4 sensors already produce ΔF/F0 responses of roughly 0.45 to 1.67. The best sensors are not yet optimized clinical tools, but they start close enough to standard exposure to make ciprofloxacin the strongest immediate lead from the screen.</w:t>
+        <w:t>Those fitted EC50 values sit above standard plasma exposure, but the curves still produce measurable fluorescence changes in the clinically relevant range. The ciprofloxacin prescribing label reports a steady-state Cmax of 2.97 µg/mL for 500 mg oral ciprofloxacin every 12 hours, which is about 9 µM given a molecular weight of 331.4 g/mol.</w:t>
+      </w:r>
+      <w:r>
+        <w:rPr>
+          <w:vertAlign w:val="superscript"/>
+        </w:rPr>
+        <w:t>13</w:t>
+      </w:r>
+      <w:r>
+        <w:t xml:space="preserve"> At 6.3 to 20 µM ciprofloxacin, the 4 sensors already produce ΔF/F0 responses of roughly 0.45 to 1.67. The best sensors are not yet optimized clinical tools, but they start close enough to standard exposure to make ciprofloxacin the strongest immediate lead from the screen.</w:t>
       </w:r>
     </w:p>
     <w:p>
@@ -466,7 +565,13 @@
     </w:p>
     <w:p>
       <w:r>
-        <w:t>Ciprofloxacin is the cleanest application lead. It is detected by multiple sensors, gives µM-scale dose responses, and produces measurable signal near standard serum exposure after oral dosing. To our knowledge, these are the first genetically encoded protein biosensor starting points for ciprofloxacin. The current sensors still need improved affinity and slope, but they start close enough that a focused directed-evolution campaign could plausibly improve sensitivity and selectivity. That expectation is realistic for this sensor class: computationally guided engineering of iNicSnFR3a produced iNicSnFR12, a nicotine sensor with a 6.1-fold higher delta-slope than its parent (Haloi et al., 2024).</w:t>
+        <w:t>Ciprofloxacin is the cleanest application lead. It is detected by multiple sensors, gives µM-scale dose responses, and produces measurable signal near standard serum exposure after oral dosing. To our knowledge, these are the first genetically encoded protein biosensor starting points for ciprofloxacin. The current sensors still need improved affinity and slope, but they start close enough that a focused directed-evolution campaign could plausibly improve sensitivity and selectivity. That expectation is realistic for this sensor class: computationally guided engineering of iNicSnFR3a produced iNicSnFR12, a nicotine sensor with a 6.1-fold higher delta-slope than its parent.</w:t>
+      </w:r>
+      <w:r>
+        <w:rPr>
+          <w:vertAlign w:val="superscript"/>
+        </w:rPr>
+        <w:t>10</w:t>
       </w:r>
     </w:p>
     <w:p>
@@ -574,7 +679,16 @@
     </w:p>
     <w:p>
       <w:r>
-        <w:t>The dataset contains 18 genetically encoded fluorescent biosensors screened against 63 ligands plus a no-ligand control. Sensor names, protein sequences, ligand names, SMILES strings, and single-concentration ΔF/F0 responses were parsed from the per-sensor raw and analyzed screening workbooks in `data_codex/v2/raw/20240724_GFP_assay`, following the published plate-screening workflow used for related CNS drug biosensor screens (Beatty et al., 2022). The analyzed workbooks store matched ligand and baseline fluorescence values; full-precision ΔF/F0 values were rebuilt from those workbooks rather than from the rounded combined heatmap. The no-ligand control row was excluded from ligand counts and downstream response summaries.</w:t>
+        <w:t>The dataset contains 18 genetically encoded fluorescent biosensors screened against 63 ligands plus a no-ligand control. Sensor names, protein sequences, ligand names, SMILES strings, and single-concentration ΔF/F0 responses were parsed from the per-sensor raw and analyzed screening workbooks in `data_codex/v2/raw/20240724_GFP_assay`, following the published plate-screening workflow used for related CNS drug biosensor screens.</w:t>
+      </w:r>
+      <w:r>
+        <w:rPr>
+          <w:vertAlign w:val="superscript"/>
+        </w:rPr>
+        <w:t>14</w:t>
+      </w:r>
+      <w:r>
+        <w:t xml:space="preserve"> The analyzed workbooks store matched ligand and baseline fluorescence values; full-precision ΔF/F0 values were rebuilt from those workbooks rather than from the rounded combined heatmap. The no-ligand control row was excluded from ligand counts and downstream response summaries.</w:t>
       </w:r>
     </w:p>
     <w:p>
@@ -592,7 +706,16 @@
     </w:p>
     <w:p>
       <w:r>
-        <w:t>Ligands were assigned to 3 pre-specified scope classes for Figure 2: alkaloid-like, non-alkaloid charged, and non-alkaloid uncharged. Alkaloid-like ligands included nicotine and related nitrogen-containing bioactive compounds in the screen. Charged compounds were identified from formal charges in RDKit-parsed SMILES, including zwitterions and permanent cations. The remaining ligands were assigned to the non-alkaloid uncharged class.</w:t>
+        <w:t>Ligands were assigned to 3 pre-specified scope classes for Figure 2: alkaloid-like, non-alkaloid charged, and non-alkaloid uncharged. Alkaloid-like ligands included nicotine and related nitrogen-containing bioactive compounds in the screen. Charged compounds were identified from formal charges in RDKit-parsed SMILES,</w:t>
+      </w:r>
+      <w:r>
+        <w:rPr>
+          <w:vertAlign w:val="superscript"/>
+        </w:rPr>
+        <w:t>15</w:t>
+      </w:r>
+      <w:r>
+        <w:t xml:space="preserve"> including zwitterions and permanent cations. The remaining ligands were assigned to the non-alkaloid uncharged class.</w:t>
       </w:r>
     </w:p>
     <w:p>
@@ -615,7 +738,16 @@
     </w:p>
     <w:p>
       <w:r>
-        <w:t>Fits used SciPy's `curve_fit` with multiple starting EC50 and Hill-coefficient guesses, lower bounds of dFmax &gt;= 0, EC50 &gt;= 1e-4 µM, and Hill coefficient &gt;= 0.1, and upper bounds of EC50 &lt;= 1e6 µM and Hill coefficient &lt;= 10. Curves with response range below 0.12 ΔF/F0 were flagged as noise. Curves with a near-flat body followed by a single high-concentration jump were flagged as step-like. Fits with EC50 &lt; 400 µM and dFmax &lt; 20 were treated as within-range reliable; the others were treated as lower-bound or out-of-range for interpretation. For Figure 4, ciprofloxacin curves were treated as the primary application-relevant dose-response result because 4 sensors gave monotonic dose-dependent responses with measurable signal from the single-digit to low-tens micromolar range and R^2 &gt; 0.99.</w:t>
+        <w:t>Fits used SciPy's `curve_fit`</w:t>
+      </w:r>
+      <w:r>
+        <w:rPr>
+          <w:vertAlign w:val="superscript"/>
+        </w:rPr>
+        <w:t>16</w:t>
+      </w:r>
+      <w:r>
+        <w:t xml:space="preserve"> with multiple starting EC50 and Hill-coefficient guesses, lower bounds of dFmax &gt;= 0, EC50 &gt;= 1e-4 µM, and Hill coefficient &gt;= 0.1, and upper bounds of EC50 &lt;= 1e6 µM and Hill coefficient &lt;= 10. Curves with response range below 0.12 ΔF/F0 were flagged as noise. Curves with a near-flat body followed by a single high-concentration jump were flagged as step-like. Fits with EC50 &lt; 400 µM and dFmax &lt; 20 were treated as within-range reliable; the others were treated as lower-bound or out-of-range for interpretation. For Figure 4, ciprofloxacin curves were treated as the primary application-relevant dose-response result because 4 sensors gave monotonic dose-dependent responses with measurable signal from the single-digit to low-tens micromolar range and R^2 &gt; 0.99.</w:t>
       </w:r>
     </w:p>
     <w:p>
@@ -654,42 +786,82 @@
     </w:p>
     <w:p>
       <w:r>
-        <w:t>Bera, K., et al. (2019). Biosensors show the pharmacokinetics of S-ketamine in the endoplasmic reticulum. Frontiers in Cellular Neuroscience, 13, 499. https://doi.org/10.3389/fncel.2019.00499</w:t>
+        <w:t>1. Marvin, J. S.; Borghuis, B. G.; Tian, L.; Cichon, J.; Harnett, M. T.; Akerboom, J.; Gordus, A.; Renninger, S. L.; Chen, T.-W.; Bargmann, C. I.; Orger, M. B.; Schreiter, E. R.; Demb, J. B.; Gan, W.-B.; Hires, S. A.; Looger, L. L. An Optimized Fluorescent Probe for Visualizing Glutamate Neurotransmission. Nat. Methods 2013, 10 (2), 162–170. DOI: 10.1038/nmeth.2333.</w:t>
       </w:r>
     </w:p>
     <w:p>
       <w:r>
-        <w:t>Beatty, E. J., et al. (2022). Fluorescence screens for identifying central nervous system-acting drug-biosensor pairs for subcellular and supracellular pharmacokinetics. Bio-protocol, 12(22), e4551. https://doi.org/10.21769/BioProtoc.4551</w:t>
+        <w:t>2. Bera, K.; Kamajaya, A.; Shivange, A. V.; Muthusamy, A. K.; Nichols, A. L.; Borden, P. M.; Grant, S.; Jeon, J.; Lin, E.; Bishara, I.; Chin, T. M.; Cohen, B. N.; Kim, C. H.; Unger, E. K.; Tian, L.; Marvin, J. S.; Looger, L. L.; Lester, H. A. Biosensors Show the Pharmacokinetics of S-Ketamine in the Endoplasmic Reticulum. Front. Cell. Neurosci. 2019, 13, 499. DOI: 10.3389/fncel.2019.00499.</w:t>
       </w:r>
     </w:p>
     <w:p>
       <w:r>
-        <w:t>DailyMed. (2025). Ciprofloxacin tablet prescribing information. National Library of Medicine. https://dailymed.nlm.nih.gov/dailymed/search.cfm?query=ciprofloxacin</w:t>
+        <w:t>3. Unger, E. K.; Keller, J. P.; Altermatt, M.; Liang, R.; Matsui, A.; Dong, C.; Hon, O. J.; Yao, Z.; Sun, J.; Banala, S.; et al. Directed Evolution of a Selective and Sensitive Serotonin Sensor via Machine Learning. Cell 2020, 183 (7), 1986–2002.e26. DOI: 10.1016/j.cell.2020.11.040.</w:t>
       </w:r>
     </w:p>
     <w:p>
       <w:r>
-        <w:t>Haloi, N., et al. (2024). Interactive computational and experimental approaches improve the sensitivity of periplasmic binding protein-based nicotine biosensors for measurements in biofluids. Protein Engineering, Design and Selection, 37, gzae003. https://doi.org/10.1093/protein/gzae003</w:t>
+        <w:t>4. Nichols, A. L.; Blumenfeld, Z.; Luebbert, L.; Knox, H. J.; Muthusamy, A. K.; Marvin, J. S.; Kim, C. H.; Grant, S. N.; Walker, A. S.; Cohen, B. N.; et al. Fluorescence Activation Mechanism and Imaging of Drug Permeation with New Sensors for Smoking-Cessation Ligands. eLife 2022, 11, e74648. DOI: 10.7554/eLife.74648.</w:t>
       </w:r>
     </w:p>
     <w:p>
       <w:r>
-        <w:t>Muthusamy, A. K., et al. (2022). Three mutations convert the selectivity of a protein sensor from nicotinic agonists to S-methadone for use in cells, organelles, and biofluids. Journal of the American Chemical Society, 144(19), 8480-8486. https://doi.org/10.1021/jacs.2c02323</w:t>
+        <w:t>5. Jumper, J.; Evans, R.; Pritzel, A.; Green, T.; Figurnov, M.; Ronneberger, O.; Tunyasuvunakool, K.; Bates, R.; Žídek, A.; Potapenko, A.; et al. Highly Accurate Protein Structure Prediction with AlphaFold. Nature 2021, 596 (7873), 583–589. DOI: 10.1038/s41586-021-03819-2.</w:t>
       </w:r>
     </w:p>
     <w:p>
       <w:r>
-        <w:t>Nichols, A. L., et al. (2022). Fluorescence activation mechanism and imaging of drug permeation with new sensors for smoking-cessation ligands. eLife, 11, e74648. https://doi.org/10.7554/eLife.74648</w:t>
+        <w:t>6. Lin, Z.; Akin, H.; Rao, R.; Hie, B.; Zhu, Z.; Lu, W.; Smetanin, N.; Verkuil, R.; Kabeli, O.; Shmueli, Y.; et al. Evolutionary-Scale Prediction of Atomic-Level Protein Structure with a Language Model. Science 2023, 379 (6637), 1123–1130. DOI: 10.1126/science.ade2574.</w:t>
       </w:r>
     </w:p>
     <w:p>
       <w:r>
-        <w:t>Shivange, A. V., et al. (2019). Determining the pharmacokinetics of nicotinic drugs in the endoplasmic reticulum using biosensors. Journal of General Physiology, 151(6), 738-757. https://doi.org/10.1085/jgp.201812201</w:t>
+        <w:t>7. Kappes, R. M.; Kempf, B.; Kneip, S.; Boch, J.; Gade, J.; Meier-Wagner, J.; Bremer, E. Two Evolutionarily Closely Related ABC Transporters Mediate the Uptake of Choline for Synthesis of the Osmoprotectant Glycine Betaine in Bacillus subtilis. Mol. Microbiol. 1999, 32 (1), 203–216. DOI: 10.1046/j.1365-2958.1999.01354.x.</w:t>
       </w:r>
     </w:p>
     <w:p>
       <w:r>
-        <w:t>Unger, E. K., et al. (2020). Directed evolution of a selective and sensitive serotonin sensor via machine learning. Cell, 183(7), 1986-2002.e26. https://doi.org/10.1016/j.cell.2020.11.040</w:t>
+        <w:t>8. Shivange, A. V.; Borden, P. M.; Muthusamy, A. K.; Nichols, A. L.; Bera, K.; Bao, H.; Bishara, I.; Jeon, J.; Mulcahy, M. J.; Cohen, B.; O'Riordan, S. L.; Kim, C.; Dougherty, D. A.; Chapman, E. R.; Marvin, J. S.; Looger, L. L.; Lester, H. A. Determining the Pharmacokinetics of Nicotinic Drugs in the Endoplasmic Reticulum Using Biosensors. J. Gen. Physiol. 2019, 151 (6), 738–757. DOI: 10.1085/jgp.201812201.</w:t>
+      </w:r>
+    </w:p>
+    <w:p>
+      <w:r>
+        <w:t>9. Muthusamy, A. K.; Kim, C. H.; Virgil, S. C.; Knox, H. J.; Marvin, J. S.; Nichols, A. L.; Cohen, B. N.; Dougherty, D. A.; Looger, L. L.; Lester, H. A. Three Mutations Convert the Selectivity of a Protein Sensor from Nicotinic Agonists to S-Methadone for Use in Cells, Organelles, and Biofluids. J. Am. Chem. Soc. 2022, 144 (19), 8480–8486. DOI: 10.1021/jacs.2c02323.</w:t>
+      </w:r>
+    </w:p>
+    <w:p>
+      <w:r>
+        <w:t>10. Haloi, N.; Huang, S.; Nichols, A. L.; Fan, E. Y.; Zhao, Y.; Aryal, S. P.; Lester, H. A.; Lindahl, E.; Dougherty, D. A. Interactive Computational and Experimental Approaches Improve the Sensitivity of Periplasmic Binding Protein-Based Nicotine Biosensors for Measurements in Biofluids. Protein Eng. Des. Sel. 2024, 37, gzae003. DOI: 10.1093/protein/gzae003.</w:t>
+      </w:r>
+    </w:p>
+    <w:p>
+      <w:r>
+        <w:t>11. Corso, G.; Stärk, H.; Jing, B.; Barzilay, R.; Jaakkola, T. DiffDock: Diffusion Steps, Twists, and Turns for Molecular Docking. In International Conference on Learning Representations (ICLR) 2023. DOI: 10.48550/arXiv.2210.01776.</w:t>
+      </w:r>
+    </w:p>
+    <w:p>
+      <w:r>
+        <w:t>12. Dougherty, D. A. The Cation-π Interaction. Acc. Chem. Res. 2013, 46 (4), 885–893. DOI: 10.1021/ar300265y.</w:t>
+      </w:r>
+    </w:p>
+    <w:p>
+      <w:r>
+        <w:t>13. Ciprofloxacin Tablet Prescribing Information. DailyMed, National Library of Medicine. https://dailymed.nlm.nih.gov (accessed 2025).</w:t>
+      </w:r>
+    </w:p>
+    <w:p>
+      <w:r>
+        <w:t>14. Beatty, E. J.; Nichols, A. L.; Bera, K.; Muthusamy, A. K.; Marvin, J. S.; Kim, C. H.; Baltanás, F. C.; Lester, H. A. Fluorescence Screens for Identifying Central Nervous System-Acting Drug-Biosensor Pairs for Subcellular and Supracellular Pharmacokinetics. Bio-protocol 2022, 12 (22), e4551. DOI: 10.21769/BioProtoc.4551.</w:t>
+      </w:r>
+    </w:p>
+    <w:p>
+      <w:r>
+        <w:t>15. RDKit: Open-Source Cheminformatics. https://www.rdkit.org (accessed 2025).</w:t>
+      </w:r>
+    </w:p>
+    <w:p>
+      <w:r>
+        <w:t>16. Virtanen, P.; Gommers, R.; Oliphant, T. E.; Haberland, M.; Reddy, T.; Cournapeau, D.; Burovski, E.; Peterson, P.; Weckesser, W.; Bright, J.; et al. SciPy 1.0: Fundamental Algorithms for Scientific Computing in Python. Nat. Methods 2020, 17 (3), 261–272. DOI: 10.1038/s41592-019-0686-2.</w:t>
       </w:r>
     </w:p>
     <w:sectPr>

</xml_diff>

<commit_message>
Figure 1: use author panel-B art, clarify panels C/D: manuscript/manuscript_biorxiv.docx
</commit_message>
<xml_diff>
--- a/manuscript/manuscript_biorxiv.docx
+++ b/manuscript/manuscript_biorxiv.docx
@@ -170,7 +170,7 @@
       <w:r>
         <w:drawing>
           <wp:inline xmlns:a="http://schemas.openxmlformats.org/drawingml/2006/main" xmlns:pic="http://schemas.openxmlformats.org/drawingml/2006/picture">
-            <wp:extent cx="5943600" cy="5218771"/>
+            <wp:extent cx="5943600" cy="5197685"/>
             <wp:docPr id="1" name="Picture 1"/>
             <wp:cNvGraphicFramePr>
               <a:graphicFrameLocks noChangeAspect="1"/>
@@ -191,7 +191,7 @@
                   <pic:spPr>
                     <a:xfrm>
                       <a:off x="0" y="0"/>
-                      <a:ext cx="5943600" cy="5218771"/>
+                      <a:ext cx="5943600" cy="5197685"/>
                     </a:xfrm>
                     <a:prstGeom prst="rect"/>
                   </pic:spPr>
@@ -230,7 +230,7 @@
         <w:rPr>
           <w:sz w:val="19"/>
         </w:rPr>
-        <w:t>), the full-length nicotine sensor, colored by module: the periplasmic binding protein (PBP) recognition domain (magenta), the circularly permuted GFP reporter (cpGFP, green), and the connecting linkers (cyan). Orange spheres mark the 31 positions that vary across the 17-member scaffold family (Cα shown); the four aromatic-cage residues Y65, Y357, F391, and W436 are drawn as yellow sticks and the GFP chromophore is shown in limon. (B) Sensing mechanism: the bilobed PBP closes around a ligand in a Venus-flytrap motion, and this conformational change is transmitted through the connecting linkers to switch the inserted cpGFP from a dim to a bright state. (C) Close-up of the binding pocket with ciprofloxacin (yellow sticks) placed by blind diffusion docking (DiffDock-L).</w:t>
+        <w:t>), the full-length nicotine sensor, colored by module: the periplasmic binding protein (PBP) recognition domain (magenta), the circularly permuted GFP reporter (cpGFP, green), and the connecting linkers (cyan). Orange spheres mark the 31 positions that vary across the 17-member scaffold family (Cα shown); the four aromatic-cage residues Y65, Y357, F391, and W436 are drawn as yellow sticks and the GFP chromophore is shown in limon. (B) Sensing mechanism (schematic): the PBP closes around a ligand (orange), and this conformational change is transmitted through the connecting linkers to switch the inserted cpGFP from a dim to a bright state. (C) Close-up of the binding pocket with ciprofloxacin (yellow sticks) placed by blind diffusion docking (DiffDock-L).</w:t>
       </w:r>
       <w:r>
         <w:rPr>
@@ -243,7 +243,7 @@
         <w:rPr>
           <w:sz w:val="19"/>
         </w:rPr>
-        <w:t xml:space="preserve"> Aromatic-cage and pocket residues are shown as marine sticks (Y65, Y357, T360, F391, W436, Y460). The pose is illustrative of a plausible binding geometry in the cage; the 7S7V structure has no drug ligand resolved in the pocket, and the geometry has not been experimentally determined. Residue 457 is phenylalanine (F457) in this family. (D) Full-length structure prediction (ESMFold</w:t>
+        <w:t xml:space="preserve"> The docked ligand (yellow) is the only small molecule shown; the blue sticks are the surrounding aromatic-cage and pocket side chains of the protein (Y65, Y357, T360, F391, W436, Y460). The pose is illustrative of a plausible binding geometry in the cage; the 7S7V structure has no drug ligand resolved in the pocket, and the geometry has not been experimentally determined. Residue 457 is phenylalanine (F457) in this family. (D) Full-length structure prediction (ESMFold</w:t>
       </w:r>
       <w:r>
         <w:rPr>
@@ -256,7 +256,7 @@
         <w:rPr>
           <w:sz w:val="19"/>
         </w:rPr>
-        <w:t>; mean pLDDT ≈ 70) superposed on the 7S7V crystal over the PBP domain. The entire crystal is shown in grey and the entire prediction in blue (darker shades, PBP lobes; lighter shades, linker and cpGFP). The predicted PBP lobes overlay the crystal closely (Cα RMSD 1.7 Å across the folded core), whereas the predicted linker and cpGFP module are displaced by ≈ 21 Å in the same frame. Current end-to-end predictors reproduce the PBP fold but not the placement of the inserted reporter, so structure-guided design in this family is presently anchored on the experimental PBP scaffold.</w:t>
+        <w:t>; mean pLDDT ≈ 70) superposed on the 7S7V crystal over the PBP domain. The entire crystal is shown in grey and the entire prediction in blue (darker shades, PBP lobes; lighter shades, linker and cpGFP). The predicted PBP lobes overlay the crystal closely (Cα RMSD 1.7 Å across the folded core; labeled), whereas the predicted linker and cpGFP module are displaced by ≈ 21 Å in the same frame (labeled). Current end-to-end predictors reproduce the PBP fold but not the placement of the inserted reporter, so structure-guided design in this family is presently anchored on the experimental PBP scaffold.</w:t>
       </w:r>
     </w:p>
     <w:p>

</xml_diff>